<commit_message>
Presentation: editable PS02 pitch deck (10 slides + appendix), interactive 3D walkthrough with three architecture scenes, data snapshots from the real API on a throwaway database, launch README, demo runbook and report; correct stale test counts; dated addenda to the paper and idea document
Co-Authored-By: Claude Opus 5.5 (1M context) <noreply@anthropic.com>
</commit_message>
<xml_diff>
--- a/docs/submission/SafeCircle-Guardian-Idea.docx
+++ b/docs/submission/SafeCircle-Guardian-Idea.docx
@@ -321,6 +321,39 @@
             </a:graphic>
           </wp:inline>
         </w:drawing>
+      </w:r>
+    </w:p>
+    <w:p>
+      <w:r>
+        <w:br w:type="page"/>
+      </w:r>
+    </w:p>
+    <w:p>
+      <w:pPr>
+        <w:pStyle w:val="Heading1"/>
+      </w:pPr>
+      <w:r>
+        <w:t>Addendum (2026-10-12): changes since this document was written</w:t>
+      </w:r>
+    </w:p>
+    <w:p>
+      <w:r>
+        <w:t>This document was written on 2026-10-10. Since then the product gained a case layer for Problem Statement 02 (AI-driven scam pattern recognition): Scam DNA investigations that re-assess a case as evidence arrives, alert de-duplication, Campaign Radar, Scam Forensics with local OCR, UPI Scam Guard, an evidence report and a scam network graph. The single-message detector described above is unchanged and its public-data results still apply to it.</w:t>
+      </w:r>
+    </w:p>
+    <w:p>
+      <w:r>
+        <w:t>The case engine was evaluated on a synthetic holdout set (v2) of 65 scenarios, frozen with a checksum before the first run. On the 51 labelled scam/benign scenarios: precision 0.885 (23/26), recall 0.958 (23/24), false-positive rate 0.111 (3/27). Errors: New-login security alert pointing to the official app (warn); Genuine delivery OTP that IS meant to be shared with the courier (false-positive trap) (alert); LPG booking confirmation (warn); Product-rating job with registration fee (clear).</w:t>
+      </w:r>
+    </w:p>
+    <w:p>
+      <w:r>
+        <w:t>A later v3 check (32 scenarios, not independent) gave precision 0.778, recall 0.933 and false-positive rate 0.235. All scenarios were written by the team that wrote the rules. Synthetic benchmark performance does not establish real-world fraud-detection accuracy.</w:t>
+      </w:r>
+    </w:p>
+    <w:p>
+      <w:r>
+        <w:t>Details: docs/scam-dna.md, docs/validation-report.md, docs/hardening-report.md, evaluation/holdout_v2 and evaluation/holdout_v3. Current pitch deck and 3D walkthrough: presentation/README.md.</w:t>
       </w:r>
     </w:p>
     <w:sectPr>

</xml_diff>